<commit_message>
Rebuild STS and the browsable specification from f0a11f8c
Generated by .github/workflows/publish.yml. Edit source/, model/ or
manifest.json — never artifacts/ or docs/, which the next build discards.
</commit_message>
<xml_diff>
--- a/artifacts/OPC-30050.docx
+++ b/artifacts/OPC-30050.docx
@@ -80,7 +80,7 @@
                                 <pic:cNvPicPr/>
                               </pic:nvPicPr>
                               <pic:blipFill>
-                                <a:blip r:embed="Rf39a350667534799"/>
+                                <a:blip r:embed="Red451c117f8d48df"/>
                                 <a:stretch>
                                   <a:fillRect/>
                                 </a:stretch>
@@ -183,7 +183,7 @@
                                 <pic:cNvPicPr/>
                               </pic:nvPicPr>
                               <pic:blipFill>
-                                <a:blip r:embed="Rdc32e4825af34bd4"/>
+                                <a:blip r:embed="R5f1daf18ebd54371"/>
                                 <a:stretch>
                                   <a:fillRect/>
                                 </a:stretch>
@@ -1535,7 +1535,7 @@
         <w:spacing w:before="60"/>
         <w:ind w:left="340"/>
       </w:pPr>
-      <w:hyperlink r:id="R03bed2c63dd94c36">
+      <w:hyperlink r:id="R80581b3b81314343">
         <w:r>
           <w:rPr>
             <w:rStyle w:val="Hyperlink"/>
@@ -1570,7 +1570,7 @@
         <w:spacing w:before="60"/>
         <w:ind w:left="340"/>
       </w:pPr>
-      <w:hyperlink r:id="Racb9fa539d654d47">
+      <w:hyperlink r:id="Rbd9c224d3eba49ee">
         <w:r>
           <w:rPr>
             <w:rStyle w:val="Hyperlink"/>
@@ -1605,7 +1605,7 @@
         <w:spacing w:before="60"/>
         <w:ind w:left="340"/>
       </w:pPr>
-      <w:hyperlink r:id="Ra30df96ecdd04be1">
+      <w:hyperlink r:id="Rbed15f9e04af48be">
         <w:r>
           <w:rPr>
             <w:rStyle w:val="Hyperlink"/>
@@ -1640,7 +1640,7 @@
         <w:spacing w:before="60"/>
         <w:ind w:left="340"/>
       </w:pPr>
-      <w:hyperlink r:id="R82a92e4934b94c93">
+      <w:hyperlink r:id="R9a7c58a5762c4592">
         <w:r>
           <w:rPr>
             <w:rStyle w:val="Hyperlink"/>
@@ -1675,7 +1675,7 @@
         <w:spacing w:before="60"/>
         <w:ind w:left="340"/>
       </w:pPr>
-      <w:hyperlink r:id="R842fe7f5918843f2">
+      <w:hyperlink r:id="R4f38c587f9d540a4">
         <w:r>
           <w:rPr>
             <w:rStyle w:val="Hyperlink"/>
@@ -1710,7 +1710,7 @@
         <w:spacing w:before="60"/>
         <w:ind w:left="340"/>
       </w:pPr>
-      <w:hyperlink r:id="R310501694e444e29">
+      <w:hyperlink r:id="R2859b30902ca4de3">
         <w:r>
           <w:rPr>
             <w:rStyle w:val="Hyperlink"/>
@@ -1745,7 +1745,7 @@
         <w:spacing w:before="60"/>
         <w:ind w:left="340"/>
       </w:pPr>
-      <w:hyperlink r:id="R8e48a2421a124fa8">
+      <w:hyperlink r:id="R9827ff0894c14fd0">
         <w:r>
           <w:rPr>
             <w:rStyle w:val="Hyperlink"/>
@@ -1780,7 +1780,7 @@
         <w:spacing w:before="60"/>
         <w:ind w:left="340"/>
       </w:pPr>
-      <w:hyperlink r:id="Rb53cd31660ac49c1">
+      <w:hyperlink r:id="Rd15f333417684bcf">
         <w:r>
           <w:rPr>
             <w:rStyle w:val="Hyperlink"/>
@@ -1815,7 +1815,7 @@
         <w:spacing w:before="60"/>
         <w:ind w:left="340"/>
       </w:pPr>
-      <w:hyperlink r:id="Rb11584dceac249ef">
+      <w:hyperlink r:id="R0dcc3339092044b2">
         <w:r>
           <w:rPr>
             <w:rStyle w:val="Hyperlink"/>
@@ -1850,7 +1850,7 @@
         <w:spacing w:before="60"/>
         <w:ind w:left="340"/>
       </w:pPr>
-      <w:hyperlink r:id="Rcaf27decd3824bb3">
+      <w:hyperlink r:id="R7f1d782936944ddd">
         <w:r>
           <w:rPr>
             <w:rStyle w:val="Hyperlink"/>
@@ -1885,7 +1885,7 @@
         <w:spacing w:before="60"/>
         <w:ind w:left="340"/>
       </w:pPr>
-      <w:hyperlink r:id="R4d018f677d174b44">
+      <w:hyperlink r:id="Rc30c64995d4549c5">
         <w:r>
           <w:rPr>
             <w:rStyle w:val="Hyperlink"/>
@@ -1920,7 +1920,7 @@
         <w:spacing w:before="60"/>
         <w:ind w:left="340"/>
       </w:pPr>
-      <w:hyperlink r:id="R038e94e229c84185">
+      <w:hyperlink r:id="R3a23ae54acaa4361">
         <w:r>
           <w:rPr>
             <w:rStyle w:val="Hyperlink"/>
@@ -1955,7 +1955,7 @@
         <w:spacing w:before="60"/>
         <w:ind w:left="340"/>
       </w:pPr>
-      <w:hyperlink r:id="R0d64871adbb741e8">
+      <w:hyperlink r:id="Ra2e566d33aaf4ee5">
         <w:r>
           <w:rPr>
             <w:rStyle w:val="Hyperlink"/>
@@ -1990,7 +1990,7 @@
         <w:spacing w:before="60"/>
         <w:ind w:left="340"/>
       </w:pPr>
-      <w:hyperlink r:id="R3be5044703cd45b6">
+      <w:hyperlink r:id="Re6e0c215ec76479b">
         <w:r>
           <w:rPr>
             <w:rStyle w:val="Hyperlink"/>
@@ -2025,7 +2025,7 @@
         <w:spacing w:before="60"/>
         <w:ind w:left="340"/>
       </w:pPr>
-      <w:hyperlink r:id="Rc94bff626a5448ea">
+      <w:hyperlink r:id="R839537057bd644dd">
         <w:r>
           <w:rPr>
             <w:rStyle w:val="Hyperlink"/>
@@ -2060,7 +2060,7 @@
         <w:spacing w:before="60"/>
         <w:ind w:left="340"/>
       </w:pPr>
-      <w:hyperlink r:id="Reed430d6c6444f33">
+      <w:hyperlink r:id="R1045492fa77b4411">
         <w:r>
           <w:rPr>
             <w:rStyle w:val="Hyperlink"/>
@@ -2095,7 +2095,7 @@
         <w:spacing w:before="60"/>
         <w:ind w:left="340"/>
       </w:pPr>
-      <w:hyperlink r:id="R0563f15fbe6b408d">
+      <w:hyperlink r:id="R6bc2f310fead4657">
         <w:r>
           <w:rPr>
             <w:rStyle w:val="Hyperlink"/>
@@ -2130,7 +2130,7 @@
         <w:spacing w:before="60"/>
         <w:ind w:left="340"/>
       </w:pPr>
-      <w:hyperlink r:id="Rdb0a897bdf3c42fd">
+      <w:hyperlink r:id="Rf0db287ffbfe4f92">
         <w:r>
           <w:rPr>
             <w:rStyle w:val="Hyperlink"/>
@@ -3324,7 +3324,7 @@
                     <pic:cNvPicPr/>
                   </pic:nvPicPr>
                   <pic:blipFill>
-                    <a:blip r:embed="R9b05c970442c4d8b"/>
+                    <a:blip r:embed="R0ff6d40fdc774b20"/>
                     <a:stretch>
                       <a:fillRect/>
                     </a:stretch>
@@ -3639,7 +3639,7 @@
                     <pic:cNvPicPr/>
                   </pic:nvPicPr>
                   <pic:blipFill>
-                    <a:blip r:embed="R2fd22bc274ce494a"/>
+                    <a:blip r:embed="Rbca9c98d1afe441d"/>
                     <a:stretch>
                       <a:fillRect/>
                     </a:stretch>
@@ -4871,7 +4871,7 @@
                     <pic:cNvPicPr/>
                   </pic:nvPicPr>
                   <pic:blipFill>
-                    <a:blip r:embed="Rfeaa971dd2e24699"/>
+                    <a:blip r:embed="Rab211ca5e6514064"/>
                     <a:stretch>
                       <a:fillRect/>
                     </a:stretch>
@@ -5176,7 +5176,7 @@
                     <pic:cNvPicPr/>
                   </pic:nvPicPr>
                   <pic:blipFill>
-                    <a:blip r:embed="Rd6d47d9c16da4e59"/>
+                    <a:blip r:embed="Rc235b0965c4f4073"/>
                     <a:stretch>
                       <a:fillRect/>
                     </a:stretch>
@@ -5584,7 +5584,7 @@
                     <pic:cNvPicPr/>
                   </pic:nvPicPr>
                   <pic:blipFill>
-                    <a:blip r:embed="R2178740b5ffc43d4"/>
+                    <a:blip r:embed="R4a07537bda5443c7"/>
                     <a:stretch>
                       <a:fillRect/>
                     </a:stretch>
@@ -5814,7 +5814,7 @@
                     <pic:cNvPicPr/>
                   </pic:nvPicPr>
                   <pic:blipFill>
-                    <a:blip r:embed="R05126968cd1747c5"/>
+                    <a:blip r:embed="R1d520a3c447f458e"/>
                     <a:stretch>
                       <a:fillRect/>
                     </a:stretch>
@@ -5918,7 +5918,7 @@
                     <pic:cNvPicPr/>
                   </pic:nvPicPr>
                   <pic:blipFill>
-                    <a:blip r:embed="Re91c218a6122427c"/>
+                    <a:blip r:embed="Rd5464c54a1584528"/>
                     <a:stretch>
                       <a:fillRect/>
                     </a:stretch>
@@ -7535,7 +7535,7 @@
                     <pic:cNvPicPr/>
                   </pic:nvPicPr>
                   <pic:blipFill>
-                    <a:blip r:embed="R65404b57a7264b5d"/>
+                    <a:blip r:embed="R574e9dd13b0d475c"/>
                     <a:stretch>
                       <a:fillRect/>
                     </a:stretch>
@@ -8159,7 +8159,7 @@
                     <pic:cNvPicPr/>
                   </pic:nvPicPr>
                   <pic:blipFill>
-                    <a:blip r:embed="Rcf372a8e60924e0f"/>
+                    <a:blip r:embed="R9381a1a77a4c4007"/>
                     <a:stretch>
                       <a:fillRect/>
                     </a:stretch>
@@ -8328,7 +8328,7 @@
                     <pic:cNvPicPr/>
                   </pic:nvPicPr>
                   <pic:blipFill>
-                    <a:blip r:embed="Rc9f4a22f4d2b4c0a"/>
+                    <a:blip r:embed="Rde7e183d57ad4f36"/>
                     <a:stretch>
                       <a:fillRect/>
                     </a:stretch>
@@ -8954,7 +8954,7 @@
                     <pic:cNvPicPr/>
                   </pic:nvPicPr>
                   <pic:blipFill>
-                    <a:blip r:embed="R33ce0567f5474811"/>
+                    <a:blip r:embed="R6a15b83d12384df3"/>
                     <a:stretch>
                       <a:fillRect/>
                     </a:stretch>
@@ -10749,7 +10749,7 @@
                     <pic:cNvPicPr/>
                   </pic:nvPicPr>
                   <pic:blipFill>
-                    <a:blip r:embed="R8ff1808c23144b21"/>
+                    <a:blip r:embed="Ra957f3d829454c6b"/>
                     <a:stretch>
                       <a:fillRect/>
                     </a:stretch>
@@ -13309,7 +13309,7 @@
                     <pic:cNvPicPr/>
                   </pic:nvPicPr>
                   <pic:blipFill>
-                    <a:blip r:embed="R3131a8dfef124610"/>
+                    <a:blip r:embed="R7f651ca016664a55"/>
                     <a:stretch>
                       <a:fillRect/>
                     </a:stretch>
@@ -15044,7 +15044,7 @@
             </w:pPr>
             <w:r>
               <w:rPr/>
-              <w:t xml:space="preserve">4:PackMLCumulativeTimesDataType</w:t>
+              <w:t xml:space="preserve">4:PackMLCumulativeTimesDataType[]</w:t>
             </w:r>
           </w:p>
         </w:tc>
@@ -16119,7 +16119,7 @@
                     <pic:cNvPicPr/>
                   </pic:nvPicPr>
                   <pic:blipFill>
-                    <a:blip r:embed="R33b7c5fd326243a0"/>
+                    <a:blip r:embed="R3b69bde208334ec5"/>
                     <a:stretch>
                       <a:fillRect/>
                     </a:stretch>
@@ -16499,7 +16499,7 @@
                     <pic:cNvPicPr/>
                   </pic:nvPicPr>
                   <pic:blipFill>
-                    <a:blip r:embed="R7ad9fb2c1de6417d"/>
+                    <a:blip r:embed="R511025f40eb94e29"/>
                     <a:stretch>
                       <a:fillRect/>
                     </a:stretch>
@@ -16704,7 +16704,7 @@
                     <pic:cNvPicPr/>
                   </pic:nvPicPr>
                   <pic:blipFill>
-                    <a:blip r:embed="R55bcc109796e42d1"/>
+                    <a:blip r:embed="Rd194ba8a3ac14249"/>
                     <a:stretch>
                       <a:fillRect/>
                     </a:stretch>
@@ -19144,7 +19144,7 @@
                     <pic:cNvPicPr/>
                   </pic:nvPicPr>
                   <pic:blipFill>
-                    <a:blip r:embed="Rded81c20b2fa4b23"/>
+                    <a:blip r:embed="Rd5a351f3ee504d58"/>
                     <a:stretch>
                       <a:fillRect/>
                     </a:stretch>
@@ -21814,7 +21814,7 @@
                     <pic:cNvPicPr/>
                   </pic:nvPicPr>
                   <pic:blipFill>
-                    <a:blip r:embed="Rd43367ae55c34fd1"/>
+                    <a:blip r:embed="R7ac67d07c1b947bb"/>
                     <a:stretch>
                       <a:fillRect/>
                     </a:stretch>
@@ -54972,7 +54972,7 @@
             <w:pPr>
               <w:pStyle w:val="TABLE-cell"/>
             </w:pPr>
-            <w:hyperlink r:id="R216d27c004d04826">
+            <w:hyperlink r:id="R5c2bca2150964c0f">
               <w:r>
                 <w:rPr>
                   <w:rStyle w:val="Hyperlink"/>
@@ -55009,7 +55009,7 @@
             <w:pPr>
               <w:pStyle w:val="TABLE-cell"/>
             </w:pPr>
-            <w:hyperlink r:id="R79ede54c9b4b4ab7">
+            <w:hyperlink r:id="R2dbdea5f0c114d3b">
               <w:r>
                 <w:rPr>
                   <w:rStyle w:val="Hyperlink"/>
@@ -66860,7 +66860,7 @@
       <w:pPr>
         <w:pStyle w:val="PARAGRAPH"/>
       </w:pPr>
-      <w:hyperlink r:id="R1d81c00f49874bd0">
+      <w:hyperlink r:id="Rb5a8cb7082014372">
         <w:r>
           <w:rPr>
             <w:rStyle w:val="Hyperlink"/>
@@ -66887,7 +66887,7 @@
         <w:rPr/>
         <w:t xml:space="preserve"> can be found </w:t>
       </w:r>
-      <w:hyperlink r:id="R6738202a6be74fb5">
+      <w:hyperlink r:id="Rbdf114cb0b834cad">
         <w:r>
           <w:rPr>
             <w:rStyle w:val="Hyperlink"/>
@@ -66913,7 +66913,7 @@
       <w:pPr>
         <w:pStyle w:val="PARAGRAPH"/>
       </w:pPr>
-      <w:hyperlink r:id="Rcaa03e7d1c754b45">
+      <w:hyperlink r:id="Rb7fb039ba2c04423">
         <w:r>
           <w:rPr>
             <w:rStyle w:val="Hyperlink"/>
@@ -66935,7 +66935,7 @@
       <w:pPr>
         <w:pStyle w:val="PARAGRAPH"/>
       </w:pPr>
-      <w:hyperlink r:id="R2970605a2acf4d73">
+      <w:hyperlink r:id="R0a1d1d6144814340">
         <w:r>
           <w:rPr>
             <w:rStyle w:val="Hyperlink"/>
@@ -66957,7 +66957,7 @@
       <w:pPr>
         <w:pStyle w:val="PARAGRAPH"/>
       </w:pPr>
-      <w:hyperlink r:id="R36c47bbc6ffb4ba8">
+      <w:hyperlink r:id="Rf172f090d224413e">
         <w:r>
           <w:rPr>
             <w:rStyle w:val="Hyperlink"/>
@@ -66979,7 +66979,7 @@
       <w:pPr>
         <w:pStyle w:val="PARAGRAPH"/>
       </w:pPr>
-      <w:hyperlink r:id="Rd34a1c0f2bf84f22">
+      <w:hyperlink r:id="R81df0e2684054bb6">
         <w:r>
           <w:rPr>
             <w:rStyle w:val="Hyperlink"/>

</xml_diff>

<commit_message>
Rebuild STS and the browsable specification from 11627ca1
Generated by .github/workflows/publish.yml. Edit source/, model/ or
manifest.json — never artifacts/ or docs/, which the next build discards.
</commit_message>
<xml_diff>
--- a/artifacts/OPC-30050.docx
+++ b/artifacts/OPC-30050.docx
@@ -80,7 +80,7 @@
                                 <pic:cNvPicPr/>
                               </pic:nvPicPr>
                               <pic:blipFill>
-                                <a:blip r:embed="Red451c117f8d48df"/>
+                                <a:blip r:embed="R041f9b97ad394dc7"/>
                                 <a:stretch>
                                   <a:fillRect/>
                                 </a:stretch>
@@ -183,7 +183,7 @@
                                 <pic:cNvPicPr/>
                               </pic:nvPicPr>
                               <pic:blipFill>
-                                <a:blip r:embed="R5f1daf18ebd54371"/>
+                                <a:blip r:embed="Rd9f58472e05944d5"/>
                                 <a:stretch>
                                   <a:fillRect/>
                                 </a:stretch>
@@ -1535,7 +1535,7 @@
         <w:spacing w:before="60"/>
         <w:ind w:left="340"/>
       </w:pPr>
-      <w:hyperlink r:id="R80581b3b81314343">
+      <w:hyperlink r:id="R713159a7414a4ec5">
         <w:r>
           <w:rPr>
             <w:rStyle w:val="Hyperlink"/>
@@ -1570,7 +1570,7 @@
         <w:spacing w:before="60"/>
         <w:ind w:left="340"/>
       </w:pPr>
-      <w:hyperlink r:id="Rbd9c224d3eba49ee">
+      <w:hyperlink r:id="R12ec3931f15d4b28">
         <w:r>
           <w:rPr>
             <w:rStyle w:val="Hyperlink"/>
@@ -1605,7 +1605,7 @@
         <w:spacing w:before="60"/>
         <w:ind w:left="340"/>
       </w:pPr>
-      <w:hyperlink r:id="Rbed15f9e04af48be">
+      <w:hyperlink r:id="R549ea28480e54065">
         <w:r>
           <w:rPr>
             <w:rStyle w:val="Hyperlink"/>
@@ -1640,7 +1640,7 @@
         <w:spacing w:before="60"/>
         <w:ind w:left="340"/>
       </w:pPr>
-      <w:hyperlink r:id="R9a7c58a5762c4592">
+      <w:hyperlink r:id="R2cbbde675ee84c07">
         <w:r>
           <w:rPr>
             <w:rStyle w:val="Hyperlink"/>
@@ -1675,7 +1675,7 @@
         <w:spacing w:before="60"/>
         <w:ind w:left="340"/>
       </w:pPr>
-      <w:hyperlink r:id="R4f38c587f9d540a4">
+      <w:hyperlink r:id="Rf27ad80910934388">
         <w:r>
           <w:rPr>
             <w:rStyle w:val="Hyperlink"/>
@@ -1710,7 +1710,7 @@
         <w:spacing w:before="60"/>
         <w:ind w:left="340"/>
       </w:pPr>
-      <w:hyperlink r:id="R2859b30902ca4de3">
+      <w:hyperlink r:id="R281551706f9a4cc4">
         <w:r>
           <w:rPr>
             <w:rStyle w:val="Hyperlink"/>
@@ -1745,7 +1745,7 @@
         <w:spacing w:before="60"/>
         <w:ind w:left="340"/>
       </w:pPr>
-      <w:hyperlink r:id="R9827ff0894c14fd0">
+      <w:hyperlink r:id="R88efa892e7be4003">
         <w:r>
           <w:rPr>
             <w:rStyle w:val="Hyperlink"/>
@@ -1780,7 +1780,7 @@
         <w:spacing w:before="60"/>
         <w:ind w:left="340"/>
       </w:pPr>
-      <w:hyperlink r:id="Rd15f333417684bcf">
+      <w:hyperlink r:id="R2b9f64c62f764230">
         <w:r>
           <w:rPr>
             <w:rStyle w:val="Hyperlink"/>
@@ -1815,7 +1815,7 @@
         <w:spacing w:before="60"/>
         <w:ind w:left="340"/>
       </w:pPr>
-      <w:hyperlink r:id="R0dcc3339092044b2">
+      <w:hyperlink r:id="Rae61d1d07307444c">
         <w:r>
           <w:rPr>
             <w:rStyle w:val="Hyperlink"/>
@@ -1850,7 +1850,7 @@
         <w:spacing w:before="60"/>
         <w:ind w:left="340"/>
       </w:pPr>
-      <w:hyperlink r:id="R7f1d782936944ddd">
+      <w:hyperlink r:id="R1de8795c82534de5">
         <w:r>
           <w:rPr>
             <w:rStyle w:val="Hyperlink"/>
@@ -1885,7 +1885,7 @@
         <w:spacing w:before="60"/>
         <w:ind w:left="340"/>
       </w:pPr>
-      <w:hyperlink r:id="Rc30c64995d4549c5">
+      <w:hyperlink r:id="R7f4b2f9d27eb4410">
         <w:r>
           <w:rPr>
             <w:rStyle w:val="Hyperlink"/>
@@ -1920,7 +1920,7 @@
         <w:spacing w:before="60"/>
         <w:ind w:left="340"/>
       </w:pPr>
-      <w:hyperlink r:id="R3a23ae54acaa4361">
+      <w:hyperlink r:id="Rb45f44af4da34325">
         <w:r>
           <w:rPr>
             <w:rStyle w:val="Hyperlink"/>
@@ -1955,7 +1955,7 @@
         <w:spacing w:before="60"/>
         <w:ind w:left="340"/>
       </w:pPr>
-      <w:hyperlink r:id="Ra2e566d33aaf4ee5">
+      <w:hyperlink r:id="Red4d81eed18e4d23">
         <w:r>
           <w:rPr>
             <w:rStyle w:val="Hyperlink"/>
@@ -1990,7 +1990,7 @@
         <w:spacing w:before="60"/>
         <w:ind w:left="340"/>
       </w:pPr>
-      <w:hyperlink r:id="Re6e0c215ec76479b">
+      <w:hyperlink r:id="R43979ae55dfb4703">
         <w:r>
           <w:rPr>
             <w:rStyle w:val="Hyperlink"/>
@@ -2025,7 +2025,7 @@
         <w:spacing w:before="60"/>
         <w:ind w:left="340"/>
       </w:pPr>
-      <w:hyperlink r:id="R839537057bd644dd">
+      <w:hyperlink r:id="Ra0e1469aba2345dd">
         <w:r>
           <w:rPr>
             <w:rStyle w:val="Hyperlink"/>
@@ -2060,7 +2060,7 @@
         <w:spacing w:before="60"/>
         <w:ind w:left="340"/>
       </w:pPr>
-      <w:hyperlink r:id="R1045492fa77b4411">
+      <w:hyperlink r:id="Rf8ace60fccc340ac">
         <w:r>
           <w:rPr>
             <w:rStyle w:val="Hyperlink"/>
@@ -2095,7 +2095,7 @@
         <w:spacing w:before="60"/>
         <w:ind w:left="340"/>
       </w:pPr>
-      <w:hyperlink r:id="R6bc2f310fead4657">
+      <w:hyperlink r:id="Rcce12a5208354f5d">
         <w:r>
           <w:rPr>
             <w:rStyle w:val="Hyperlink"/>
@@ -2130,7 +2130,7 @@
         <w:spacing w:before="60"/>
         <w:ind w:left="340"/>
       </w:pPr>
-      <w:hyperlink r:id="Rf0db287ffbfe4f92">
+      <w:hyperlink r:id="Rc475136a86234b6f">
         <w:r>
           <w:rPr>
             <w:rStyle w:val="Hyperlink"/>
@@ -3324,7 +3324,7 @@
                     <pic:cNvPicPr/>
                   </pic:nvPicPr>
                   <pic:blipFill>
-                    <a:blip r:embed="R0ff6d40fdc774b20"/>
+                    <a:blip r:embed="R6e23168ca7ae4267"/>
                     <a:stretch>
                       <a:fillRect/>
                     </a:stretch>
@@ -3615,7 +3615,7 @@
       </w:pPr>
       <w:r>
         <w:rPr/>
-        <w:t xml:space="preserve">The states that a unit can be in depends on the mode. In production mode there is a state called SUSPENDED, where the equipment is not running due to an external event, but this state is not available in maintenance mode, neither is the COMPLETE state.</w:t>
+        <w:t xml:space="preserve">The states that a unit can be in depends on the mode. In production mode there is a state called SUSPENDED, where the equipment is not running due to an external event, but this state is not available in maintenance mode, neither is the COMPLETED state.</w:t>
       </w:r>
     </w:p>
     <w:p>
@@ -3639,7 +3639,7 @@
                     <pic:cNvPicPr/>
                   </pic:nvPicPr>
                   <pic:blipFill>
-                    <a:blip r:embed="Rbca9c98d1afe441d"/>
+                    <a:blip r:embed="Ra803f36e4f5c4b38"/>
                     <a:stretch>
                       <a:fillRect/>
                     </a:stretch>
@@ -4871,7 +4871,7 @@
                     <pic:cNvPicPr/>
                   </pic:nvPicPr>
                   <pic:blipFill>
-                    <a:blip r:embed="Rab211ca5e6514064"/>
+                    <a:blip r:embed="R58b6cb2a706840f5"/>
                     <a:stretch>
                       <a:fillRect/>
                     </a:stretch>
@@ -5176,7 +5176,7 @@
                     <pic:cNvPicPr/>
                   </pic:nvPicPr>
                   <pic:blipFill>
-                    <a:blip r:embed="Rc235b0965c4f4073"/>
+                    <a:blip r:embed="R1f701ebc422b41b5"/>
                     <a:stretch>
                       <a:fillRect/>
                     </a:stretch>
@@ -5584,7 +5584,7 @@
                     <pic:cNvPicPr/>
                   </pic:nvPicPr>
                   <pic:blipFill>
-                    <a:blip r:embed="R4a07537bda5443c7"/>
+                    <a:blip r:embed="R34ced86fbfaa435d"/>
                     <a:stretch>
                       <a:fillRect/>
                     </a:stretch>
@@ -5814,7 +5814,7 @@
                     <pic:cNvPicPr/>
                   </pic:nvPicPr>
                   <pic:blipFill>
-                    <a:blip r:embed="R1d520a3c447f458e"/>
+                    <a:blip r:embed="Ra6636ffb5f1f4b75"/>
                     <a:stretch>
                       <a:fillRect/>
                     </a:stretch>
@@ -5918,7 +5918,7 @@
                     <pic:cNvPicPr/>
                   </pic:nvPicPr>
                   <pic:blipFill>
-                    <a:blip r:embed="Rd5464c54a1584528"/>
+                    <a:blip r:embed="R520ed1319449423b"/>
                     <a:stretch>
                       <a:fillRect/>
                     </a:stretch>
@@ -7535,7 +7535,7 @@
                     <pic:cNvPicPr/>
                   </pic:nvPicPr>
                   <pic:blipFill>
-                    <a:blip r:embed="R574e9dd13b0d475c"/>
+                    <a:blip r:embed="Ra338be633ffd45ac"/>
                     <a:stretch>
                       <a:fillRect/>
                     </a:stretch>
@@ -8159,7 +8159,7 @@
                     <pic:cNvPicPr/>
                   </pic:nvPicPr>
                   <pic:blipFill>
-                    <a:blip r:embed="R9381a1a77a4c4007"/>
+                    <a:blip r:embed="R006654385a5944fb"/>
                     <a:stretch>
                       <a:fillRect/>
                     </a:stretch>
@@ -8328,7 +8328,7 @@
                     <pic:cNvPicPr/>
                   </pic:nvPicPr>
                   <pic:blipFill>
-                    <a:blip r:embed="Rde7e183d57ad4f36"/>
+                    <a:blip r:embed="R8093cf6ed604492d"/>
                     <a:stretch>
                       <a:fillRect/>
                     </a:stretch>
@@ -8954,7 +8954,7 @@
                     <pic:cNvPicPr/>
                   </pic:nvPicPr>
                   <pic:blipFill>
-                    <a:blip r:embed="R6a15b83d12384df3"/>
+                    <a:blip r:embed="R5bb4102afd774711"/>
                     <a:stretch>
                       <a:fillRect/>
                     </a:stretch>
@@ -10749,7 +10749,7 @@
                     <pic:cNvPicPr/>
                   </pic:nvPicPr>
                   <pic:blipFill>
-                    <a:blip r:embed="Ra957f3d829454c6b"/>
+                    <a:blip r:embed="R7fe6fa2f9c7f4a9f"/>
                     <a:stretch>
                       <a:fillRect/>
                     </a:stretch>
@@ -13309,7 +13309,7 @@
                     <pic:cNvPicPr/>
                   </pic:nvPicPr>
                   <pic:blipFill>
-                    <a:blip r:embed="R7f651ca016664a55"/>
+                    <a:blip r:embed="R56ea5389ea984bb9"/>
                     <a:stretch>
                       <a:fillRect/>
                     </a:stretch>
@@ -16119,7 +16119,7 @@
                     <pic:cNvPicPr/>
                   </pic:nvPicPr>
                   <pic:blipFill>
-                    <a:blip r:embed="R3b69bde208334ec5"/>
+                    <a:blip r:embed="Raa0d1230346349de"/>
                     <a:stretch>
                       <a:fillRect/>
                     </a:stretch>
@@ -16499,7 +16499,7 @@
                     <pic:cNvPicPr/>
                   </pic:nvPicPr>
                   <pic:blipFill>
-                    <a:blip r:embed="R511025f40eb94e29"/>
+                    <a:blip r:embed="R84049fd323e64349"/>
                     <a:stretch>
                       <a:fillRect/>
                     </a:stretch>
@@ -16704,7 +16704,7 @@
                     <pic:cNvPicPr/>
                   </pic:nvPicPr>
                   <pic:blipFill>
-                    <a:blip r:embed="Rd194ba8a3ac14249"/>
+                    <a:blip r:embed="R02fbd1cda3e142ed"/>
                     <a:stretch>
                       <a:fillRect/>
                     </a:stretch>
@@ -19144,7 +19144,7 @@
                     <pic:cNvPicPr/>
                   </pic:nvPicPr>
                   <pic:blipFill>
-                    <a:blip r:embed="Rd5a351f3ee504d58"/>
+                    <a:blip r:embed="R3b1c4eb32f1449d5"/>
                     <a:stretch>
                       <a:fillRect/>
                     </a:stretch>
@@ -21814,7 +21814,7 @@
                     <pic:cNvPicPr/>
                   </pic:nvPicPr>
                   <pic:blipFill>
-                    <a:blip r:embed="R7ac67d07c1b947bb"/>
+                    <a:blip r:embed="R07b15cd2df8e423d"/>
                     <a:stretch>
                       <a:fillRect/>
                     </a:stretch>
@@ -22290,7 +22290,7 @@
             </w:pPr>
             <w:r>
               <w:rPr/>
-              <w:t xml:space="preserve">4:Complete</w:t>
+              <w:t xml:space="preserve">4:Completed</w:t>
             </w:r>
           </w:p>
         </w:tc>
@@ -22365,7 +22365,7 @@
             </w:pPr>
             <w:r>
               <w:rPr/>
-              <w:t xml:space="preserve">4:CompleteToResetting</w:t>
+              <w:t xml:space="preserve">4:CompletedToResetting</w:t>
             </w:r>
           </w:p>
         </w:tc>
@@ -22515,7 +22515,7 @@
             </w:pPr>
             <w:r>
               <w:rPr/>
-              <w:t xml:space="preserve">4:CompletingToComplete</w:t>
+              <w:t xml:space="preserve">4:CompletingToCompleted</w:t>
             </w:r>
           </w:p>
         </w:tc>
@@ -24505,7 +24505,7 @@
             </w:pPr>
             <w:r>
               <w:rPr/>
-              <w:t xml:space="preserve">4:ToComplete</w:t>
+              <w:t xml:space="preserve">4:Complete</w:t>
             </w:r>
           </w:p>
         </w:tc>
@@ -25456,7 +25456,7 @@
         <w:rPr>
           <w:i/>
         </w:rPr>
-        <w:t xml:space="preserve">Complete</w:t>
+        <w:t xml:space="preserve">Completed</w:t>
       </w:r>
       <w:r>
         <w:rPr/>
@@ -25966,7 +25966,7 @@
         <w:rPr>
           <w:i/>
         </w:rPr>
-        <w:t xml:space="preserve">Complete</w:t>
+        <w:t xml:space="preserve">Completed</w:t>
       </w:r>
       <w:r>
         <w:rPr/>
@@ -25991,7 +25991,7 @@
         <w:rPr>
           <w:i/>
         </w:rPr>
-        <w:t xml:space="preserve">Complete</w:t>
+        <w:t xml:space="preserve">Completed</w:t>
       </w:r>
       <w:r>
         <w:rPr/>
@@ -26001,7 +26001,7 @@
         <w:rPr>
           <w:i/>
         </w:rPr>
-        <w:t xml:space="preserve">Complete</w:t>
+        <w:t xml:space="preserve">Completed</w:t>
       </w:r>
       <w:r>
         <w:rPr/>
@@ -29020,7 +29020,7 @@
             </w:pPr>
             <w:r>
               <w:rPr/>
-              <w:t xml:space="preserve">ToComplete</w:t>
+              <w:t xml:space="preserve">Complete</w:t>
             </w:r>
           </w:p>
         </w:tc>
@@ -29038,7 +29038,7 @@
             </w:pPr>
             <w:r>
               <w:rPr/>
-              <w:t xml:space="preserve">CompletingToComplete</w:t>
+              <w:t xml:space="preserve">CompletingToCompleted</w:t>
             </w:r>
           </w:p>
         </w:tc>
@@ -29142,7 +29142,7 @@
             </w:pPr>
             <w:r>
               <w:rPr/>
-              <w:t xml:space="preserve">Complete</w:t>
+              <w:t xml:space="preserve">Completed</w:t>
             </w:r>
           </w:p>
         </w:tc>
@@ -29160,7 +29160,7 @@
             </w:pPr>
             <w:r>
               <w:rPr/>
-              <w:t xml:space="preserve">CompleteToResetting</w:t>
+              <w:t xml:space="preserve">CompletedToResetting</w:t>
             </w:r>
           </w:p>
         </w:tc>
@@ -29205,7 +29205,7 @@
             </w:pPr>
             <w:r>
               <w:rPr/>
-              <w:t xml:space="preserve">Complete</w:t>
+              <w:t xml:space="preserve">Completed</w:t>
             </w:r>
           </w:p>
         </w:tc>
@@ -43384,7 +43384,7 @@
       <w:bookmarkStart w:name="Sts_sec_6_7_9" w:id="167"/>
       <w:r>
         <w:rPr/>
-        <w:t xml:space="preserve">ToComplete Method</w:t>
+        <w:t xml:space="preserve">Complete Method</w:t>
       </w:r>
       <w:bookmarkEnd w:id="167"/>
     </w:p>
@@ -43430,7 +43430,7 @@
         <w:rPr>
           <w:i/>
         </w:rPr>
-        <w:t xml:space="preserve">Complete</w:t>
+        <w:t xml:space="preserve">Completed</w:t>
       </w:r>
       <w:r>
         <w:rPr/>
@@ -43453,7 +43453,7 @@
         <w:pStyle w:val="CODE"/>
       </w:pPr>
       <w:r>
-        <w:t xml:space="preserve">	ToComplete(</w:t>
+        <w:t xml:space="preserve">	Complete(</w:t>
       </w:r>
       <w:r>
         <w:br/>
@@ -43519,7 +43519,7 @@
       </w:r>
       <w:r>
         <w:rPr/>
-        <w:t xml:space="preserve">ToComplete Method Result Codes</w:t>
+        <w:t xml:space="preserve">Complete Method Result Codes</w:t>
       </w:r>
     </w:p>
     <w:tbl>
@@ -43838,7 +43838,7 @@
         <w:rPr>
           <w:i/>
         </w:rPr>
-        <w:t xml:space="preserve">ToComplete Method</w:t>
+        <w:t xml:space="preserve">Complete Method</w:t>
       </w:r>
       <w:r>
         <w:rPr/>
@@ -43848,7 +43848,7 @@
         <w:rPr>
           <w:i/>
         </w:rPr>
-        <w:t xml:space="preserve">ToComplete</w:t>
+        <w:t xml:space="preserve">Complete</w:t>
       </w:r>
       <w:r>
         <w:rPr/>
@@ -43885,7 +43885,7 @@
       </w:r>
       <w:r>
         <w:rPr/>
-        <w:t xml:space="preserve">ToComplete Method AddressSpace Definition</w:t>
+        <w:t xml:space="preserve">Complete Method AddressSpace Definition</w:t>
       </w:r>
     </w:p>
     <w:tbl>
@@ -43967,7 +43967,7 @@
             </w:pPr>
             <w:r>
               <w:rPr/>
-              <w:t xml:space="preserve">ToComplete</w:t>
+              <w:t xml:space="preserve">Complete</w:t>
             </w:r>
           </w:p>
         </w:tc>
@@ -54972,7 +54972,7 @@
             <w:pPr>
               <w:pStyle w:val="TABLE-cell"/>
             </w:pPr>
-            <w:hyperlink r:id="R5c2bca2150964c0f">
+            <w:hyperlink r:id="R559cc46082d94061">
               <w:r>
                 <w:rPr>
                   <w:rStyle w:val="Hyperlink"/>
@@ -55009,7 +55009,7 @@
             <w:pPr>
               <w:pStyle w:val="TABLE-cell"/>
             </w:pPr>
-            <w:hyperlink r:id="R2dbdea5f0c114d3b">
+            <w:hyperlink r:id="R7e3b38ddc6e94057">
               <w:r>
                 <w:rPr>
                   <w:rStyle w:val="Hyperlink"/>
@@ -59491,7 +59491,7 @@
             </w:pPr>
             <w:r>
               <w:rPr/>
-              <w:t xml:space="preserve">2.0.7</w:t>
+              <w:t xml:space="preserve">2.0.9</w:t>
             </w:r>
           </w:p>
         </w:tc>
@@ -59539,7 +59539,7 @@
             </w:pPr>
             <w:r>
               <w:rPr/>
-              <w:t xml:space="preserve">2026-10-09</w:t>
+              <w:t xml:space="preserve">2026-10-15</w:t>
             </w:r>
           </w:p>
         </w:tc>
@@ -61880,7 +61880,7 @@
             </w:pPr>
             <w:r>
               <w:rPr/>
-              <w:t xml:space="preserve">Complete</w:t>
+              <w:t xml:space="preserve">Completed</w:t>
             </w:r>
           </w:p>
         </w:tc>
@@ -61895,7 +61895,7 @@
             </w:pPr>
             <w:r>
               <w:rPr/>
-              <w:t xml:space="preserve">Complete</w:t>
+              <w:t xml:space="preserve">Completed</w:t>
             </w:r>
           </w:p>
         </w:tc>
@@ -63154,7 +63154,7 @@
             </w:pPr>
             <w:r>
               <w:rPr/>
-              <w:t xml:space="preserve">Complete</w:t>
+              <w:t xml:space="preserve">Completed</w:t>
             </w:r>
           </w:p>
         </w:tc>
@@ -64428,7 +64428,7 @@
             </w:pPr>
             <w:r>
               <w:rPr/>
-              <w:t xml:space="preserve">Complete</w:t>
+              <w:t xml:space="preserve">Completed</w:t>
             </w:r>
           </w:p>
         </w:tc>
@@ -66860,7 +66860,7 @@
       <w:pPr>
         <w:pStyle w:val="PARAGRAPH"/>
       </w:pPr>
-      <w:hyperlink r:id="Rb5a8cb7082014372">
+      <w:hyperlink r:id="R061abfd71500454e">
         <w:r>
           <w:rPr>
             <w:rStyle w:val="Hyperlink"/>
@@ -66887,7 +66887,7 @@
         <w:rPr/>
         <w:t xml:space="preserve"> can be found </w:t>
       </w:r>
-      <w:hyperlink r:id="Rbdf114cb0b834cad">
+      <w:hyperlink r:id="R2beb3e24551a4964">
         <w:r>
           <w:rPr>
             <w:rStyle w:val="Hyperlink"/>
@@ -66913,7 +66913,7 @@
       <w:pPr>
         <w:pStyle w:val="PARAGRAPH"/>
       </w:pPr>
-      <w:hyperlink r:id="Rb7fb039ba2c04423">
+      <w:hyperlink r:id="R342b42cf488c4ac7">
         <w:r>
           <w:rPr>
             <w:rStyle w:val="Hyperlink"/>
@@ -66935,7 +66935,7 @@
       <w:pPr>
         <w:pStyle w:val="PARAGRAPH"/>
       </w:pPr>
-      <w:hyperlink r:id="R0a1d1d6144814340">
+      <w:hyperlink r:id="R7fc821aa9e674006">
         <w:r>
           <w:rPr>
             <w:rStyle w:val="Hyperlink"/>
@@ -66957,7 +66957,7 @@
       <w:pPr>
         <w:pStyle w:val="PARAGRAPH"/>
       </w:pPr>
-      <w:hyperlink r:id="Rf172f090d224413e">
+      <w:hyperlink r:id="Rc7b3535a08d641cb">
         <w:r>
           <w:rPr>
             <w:rStyle w:val="Hyperlink"/>
@@ -66979,7 +66979,7 @@
       <w:pPr>
         <w:pStyle w:val="PARAGRAPH"/>
       </w:pPr>
-      <w:hyperlink r:id="R81df0e2684054bb6">
+      <w:hyperlink r:id="R158446c130d34fb3">
         <w:r>
           <w:rPr>
             <w:rStyle w:val="Hyperlink"/>

</xml_diff>

<commit_message>
Rebuild STS and the browsable specification from 054ce99a
Generated by .github/workflows/publish.yml. Edit source/, model/ or
manifest.json — never artifacts/ or docs/, which the next build discards.
</commit_message>
<xml_diff>
--- a/artifacts/OPC-30050.docx
+++ b/artifacts/OPC-30050.docx
@@ -80,7 +80,7 @@
                                 <pic:cNvPicPr/>
                               </pic:nvPicPr>
                               <pic:blipFill>
-                                <a:blip r:embed="R041f9b97ad394dc7"/>
+                                <a:blip r:embed="R687f1709a1ef42f1"/>
                                 <a:stretch>
                                   <a:fillRect/>
                                 </a:stretch>
@@ -183,7 +183,7 @@
                                 <pic:cNvPicPr/>
                               </pic:nvPicPr>
                               <pic:blipFill>
-                                <a:blip r:embed="Rd9f58472e05944d5"/>
+                                <a:blip r:embed="R01b28f87e9494c12"/>
                                 <a:stretch>
                                   <a:fillRect/>
                                 </a:stretch>
@@ -1535,7 +1535,7 @@
         <w:spacing w:before="60"/>
         <w:ind w:left="340"/>
       </w:pPr>
-      <w:hyperlink r:id="R713159a7414a4ec5">
+      <w:hyperlink r:id="R4b4eeaac32514cfa">
         <w:r>
           <w:rPr>
             <w:rStyle w:val="Hyperlink"/>
@@ -1570,7 +1570,7 @@
         <w:spacing w:before="60"/>
         <w:ind w:left="340"/>
       </w:pPr>
-      <w:hyperlink r:id="R12ec3931f15d4b28">
+      <w:hyperlink r:id="R34ca95d6d6c4447a">
         <w:r>
           <w:rPr>
             <w:rStyle w:val="Hyperlink"/>
@@ -1605,7 +1605,7 @@
         <w:spacing w:before="60"/>
         <w:ind w:left="340"/>
       </w:pPr>
-      <w:hyperlink r:id="R549ea28480e54065">
+      <w:hyperlink r:id="R1a42197ca50b44d6">
         <w:r>
           <w:rPr>
             <w:rStyle w:val="Hyperlink"/>
@@ -1640,7 +1640,7 @@
         <w:spacing w:before="60"/>
         <w:ind w:left="340"/>
       </w:pPr>
-      <w:hyperlink r:id="R2cbbde675ee84c07">
+      <w:hyperlink r:id="R13bc604b666a4b06">
         <w:r>
           <w:rPr>
             <w:rStyle w:val="Hyperlink"/>
@@ -1675,7 +1675,7 @@
         <w:spacing w:before="60"/>
         <w:ind w:left="340"/>
       </w:pPr>
-      <w:hyperlink r:id="Rf27ad80910934388">
+      <w:hyperlink r:id="R9a4169375a6242d2">
         <w:r>
           <w:rPr>
             <w:rStyle w:val="Hyperlink"/>
@@ -1710,7 +1710,7 @@
         <w:spacing w:before="60"/>
         <w:ind w:left="340"/>
       </w:pPr>
-      <w:hyperlink r:id="R281551706f9a4cc4">
+      <w:hyperlink r:id="Rf278219dc3914563">
         <w:r>
           <w:rPr>
             <w:rStyle w:val="Hyperlink"/>
@@ -1745,7 +1745,7 @@
         <w:spacing w:before="60"/>
         <w:ind w:left="340"/>
       </w:pPr>
-      <w:hyperlink r:id="R88efa892e7be4003">
+      <w:hyperlink r:id="R4a47cdd398dc4bf3">
         <w:r>
           <w:rPr>
             <w:rStyle w:val="Hyperlink"/>
@@ -1780,7 +1780,7 @@
         <w:spacing w:before="60"/>
         <w:ind w:left="340"/>
       </w:pPr>
-      <w:hyperlink r:id="R2b9f64c62f764230">
+      <w:hyperlink r:id="R8cd38a11114a4e94">
         <w:r>
           <w:rPr>
             <w:rStyle w:val="Hyperlink"/>
@@ -1815,7 +1815,7 @@
         <w:spacing w:before="60"/>
         <w:ind w:left="340"/>
       </w:pPr>
-      <w:hyperlink r:id="Rae61d1d07307444c">
+      <w:hyperlink r:id="R4b484063d5124420">
         <w:r>
           <w:rPr>
             <w:rStyle w:val="Hyperlink"/>
@@ -1850,7 +1850,7 @@
         <w:spacing w:before="60"/>
         <w:ind w:left="340"/>
       </w:pPr>
-      <w:hyperlink r:id="R1de8795c82534de5">
+      <w:hyperlink r:id="Rd654c798d6dc4c94">
         <w:r>
           <w:rPr>
             <w:rStyle w:val="Hyperlink"/>
@@ -1885,7 +1885,7 @@
         <w:spacing w:before="60"/>
         <w:ind w:left="340"/>
       </w:pPr>
-      <w:hyperlink r:id="R7f4b2f9d27eb4410">
+      <w:hyperlink r:id="R00aea575b537488e">
         <w:r>
           <w:rPr>
             <w:rStyle w:val="Hyperlink"/>
@@ -1920,7 +1920,7 @@
         <w:spacing w:before="60"/>
         <w:ind w:left="340"/>
       </w:pPr>
-      <w:hyperlink r:id="Rb45f44af4da34325">
+      <w:hyperlink r:id="Rd15facdea65747be">
         <w:r>
           <w:rPr>
             <w:rStyle w:val="Hyperlink"/>
@@ -1955,7 +1955,7 @@
         <w:spacing w:before="60"/>
         <w:ind w:left="340"/>
       </w:pPr>
-      <w:hyperlink r:id="Red4d81eed18e4d23">
+      <w:hyperlink r:id="Re7e8230b85ea4e65">
         <w:r>
           <w:rPr>
             <w:rStyle w:val="Hyperlink"/>
@@ -1990,7 +1990,7 @@
         <w:spacing w:before="60"/>
         <w:ind w:left="340"/>
       </w:pPr>
-      <w:hyperlink r:id="R43979ae55dfb4703">
+      <w:hyperlink r:id="R243c41633f42454b">
         <w:r>
           <w:rPr>
             <w:rStyle w:val="Hyperlink"/>
@@ -2025,7 +2025,7 @@
         <w:spacing w:before="60"/>
         <w:ind w:left="340"/>
       </w:pPr>
-      <w:hyperlink r:id="Ra0e1469aba2345dd">
+      <w:hyperlink r:id="R1edeaacb927d4fdf">
         <w:r>
           <w:rPr>
             <w:rStyle w:val="Hyperlink"/>
@@ -2060,7 +2060,7 @@
         <w:spacing w:before="60"/>
         <w:ind w:left="340"/>
       </w:pPr>
-      <w:hyperlink r:id="Rf8ace60fccc340ac">
+      <w:hyperlink r:id="Rcfd96ea3d0ea41ea">
         <w:r>
           <w:rPr>
             <w:rStyle w:val="Hyperlink"/>
@@ -2095,7 +2095,7 @@
         <w:spacing w:before="60"/>
         <w:ind w:left="340"/>
       </w:pPr>
-      <w:hyperlink r:id="Rcce12a5208354f5d">
+      <w:hyperlink r:id="R7da7382cba5741c4">
         <w:r>
           <w:rPr>
             <w:rStyle w:val="Hyperlink"/>
@@ -2130,7 +2130,7 @@
         <w:spacing w:before="60"/>
         <w:ind w:left="340"/>
       </w:pPr>
-      <w:hyperlink r:id="Rc475136a86234b6f">
+      <w:hyperlink r:id="Rf120fbfd739249c8">
         <w:r>
           <w:rPr>
             <w:rStyle w:val="Hyperlink"/>
@@ -3324,7 +3324,7 @@
                     <pic:cNvPicPr/>
                   </pic:nvPicPr>
                   <pic:blipFill>
-                    <a:blip r:embed="R6e23168ca7ae4267"/>
+                    <a:blip r:embed="Rcb5c80ab01e44aa8"/>
                     <a:stretch>
                       <a:fillRect/>
                     </a:stretch>
@@ -3639,7 +3639,7 @@
                     <pic:cNvPicPr/>
                   </pic:nvPicPr>
                   <pic:blipFill>
-                    <a:blip r:embed="Ra803f36e4f5c4b38"/>
+                    <a:blip r:embed="R09d0b1721fe54efc"/>
                     <a:stretch>
                       <a:fillRect/>
                     </a:stretch>
@@ -4871,7 +4871,7 @@
                     <pic:cNvPicPr/>
                   </pic:nvPicPr>
                   <pic:blipFill>
-                    <a:blip r:embed="R58b6cb2a706840f5"/>
+                    <a:blip r:embed="Rde66ac3dc18841ea"/>
                     <a:stretch>
                       <a:fillRect/>
                     </a:stretch>
@@ -5176,7 +5176,7 @@
                     <pic:cNvPicPr/>
                   </pic:nvPicPr>
                   <pic:blipFill>
-                    <a:blip r:embed="R1f701ebc422b41b5"/>
+                    <a:blip r:embed="Rebe56dbff79e4b1d"/>
                     <a:stretch>
                       <a:fillRect/>
                     </a:stretch>
@@ -5584,7 +5584,7 @@
                     <pic:cNvPicPr/>
                   </pic:nvPicPr>
                   <pic:blipFill>
-                    <a:blip r:embed="R34ced86fbfaa435d"/>
+                    <a:blip r:embed="Re4b7af7d28044132"/>
                     <a:stretch>
                       <a:fillRect/>
                     </a:stretch>
@@ -5814,7 +5814,7 @@
                     <pic:cNvPicPr/>
                   </pic:nvPicPr>
                   <pic:blipFill>
-                    <a:blip r:embed="Ra6636ffb5f1f4b75"/>
+                    <a:blip r:embed="Ra6193bc7de704108"/>
                     <a:stretch>
                       <a:fillRect/>
                     </a:stretch>
@@ -5918,7 +5918,7 @@
                     <pic:cNvPicPr/>
                   </pic:nvPicPr>
                   <pic:blipFill>
-                    <a:blip r:embed="R520ed1319449423b"/>
+                    <a:blip r:embed="R1d24f9373d414fdc"/>
                     <a:stretch>
                       <a:fillRect/>
                     </a:stretch>
@@ -7535,7 +7535,7 @@
                     <pic:cNvPicPr/>
                   </pic:nvPicPr>
                   <pic:blipFill>
-                    <a:blip r:embed="Ra338be633ffd45ac"/>
+                    <a:blip r:embed="R390c818f186944c0"/>
                     <a:stretch>
                       <a:fillRect/>
                     </a:stretch>
@@ -8159,7 +8159,7 @@
                     <pic:cNvPicPr/>
                   </pic:nvPicPr>
                   <pic:blipFill>
-                    <a:blip r:embed="R006654385a5944fb"/>
+                    <a:blip r:embed="Rb408b393638c40f9"/>
                     <a:stretch>
                       <a:fillRect/>
                     </a:stretch>
@@ -8328,7 +8328,7 @@
                     <pic:cNvPicPr/>
                   </pic:nvPicPr>
                   <pic:blipFill>
-                    <a:blip r:embed="R8093cf6ed604492d"/>
+                    <a:blip r:embed="Raba6773670244a3c"/>
                     <a:stretch>
                       <a:fillRect/>
                     </a:stretch>
@@ -8954,7 +8954,7 @@
                     <pic:cNvPicPr/>
                   </pic:nvPicPr>
                   <pic:blipFill>
-                    <a:blip r:embed="R5bb4102afd774711"/>
+                    <a:blip r:embed="R04411a6a6ee14b85"/>
                     <a:stretch>
                       <a:fillRect/>
                     </a:stretch>
@@ -10749,7 +10749,7 @@
                     <pic:cNvPicPr/>
                   </pic:nvPicPr>
                   <pic:blipFill>
-                    <a:blip r:embed="R7fe6fa2f9c7f4a9f"/>
+                    <a:blip r:embed="R4bb97727d4484d92"/>
                     <a:stretch>
                       <a:fillRect/>
                     </a:stretch>
@@ -12064,7 +12064,7 @@
             </w:pPr>
             <w:r>
               <w:rPr/>
-              <w:t xml:space="preserve">M</w:t>
+              <w:t xml:space="preserve">O</w:t>
             </w:r>
           </w:p>
         </w:tc>
@@ -13309,7 +13309,7 @@
                     <pic:cNvPicPr/>
                   </pic:nvPicPr>
                   <pic:blipFill>
-                    <a:blip r:embed="R56ea5389ea984bb9"/>
+                    <a:blip r:embed="R9c8f49f8fa704f77"/>
                     <a:stretch>
                       <a:fillRect/>
                     </a:stretch>
@@ -16119,7 +16119,7 @@
                     <pic:cNvPicPr/>
                   </pic:nvPicPr>
                   <pic:blipFill>
-                    <a:blip r:embed="Raa0d1230346349de"/>
+                    <a:blip r:embed="R4334d3501075477a"/>
                     <a:stretch>
                       <a:fillRect/>
                     </a:stretch>
@@ -16499,7 +16499,7 @@
                     <pic:cNvPicPr/>
                   </pic:nvPicPr>
                   <pic:blipFill>
-                    <a:blip r:embed="R84049fd323e64349"/>
+                    <a:blip r:embed="Rd83c9d12a0364efc"/>
                     <a:stretch>
                       <a:fillRect/>
                     </a:stretch>
@@ -16704,7 +16704,7 @@
                     <pic:cNvPicPr/>
                   </pic:nvPicPr>
                   <pic:blipFill>
-                    <a:blip r:embed="R02fbd1cda3e142ed"/>
+                    <a:blip r:embed="R13e7a8a923984f30"/>
                     <a:stretch>
                       <a:fillRect/>
                     </a:stretch>
@@ -19144,7 +19144,7 @@
                     <pic:cNvPicPr/>
                   </pic:nvPicPr>
                   <pic:blipFill>
-                    <a:blip r:embed="R3b1c4eb32f1449d5"/>
+                    <a:blip r:embed="R631de33ac15a4386"/>
                     <a:stretch>
                       <a:fillRect/>
                     </a:stretch>
@@ -21814,7 +21814,7 @@
                     <pic:cNvPicPr/>
                   </pic:nvPicPr>
                   <pic:blipFill>
-                    <a:blip r:embed="R07b15cd2df8e423d"/>
+                    <a:blip r:embed="R6c4283b5a39b485a"/>
                     <a:stretch>
                       <a:fillRect/>
                     </a:stretch>
@@ -52826,7 +52826,7 @@
             </w:pPr>
             <w:r>
               <w:rPr/>
-              <w:t xml:space="preserve">PackML Equipment Blocked</w:t>
+              <w:t xml:space="preserve">PackML EquipmentInterlock Blocked</w:t>
             </w:r>
           </w:p>
         </w:tc>
@@ -52841,7 +52841,7 @@
             </w:pPr>
             <w:r>
               <w:rPr/>
-              <w:t xml:space="preserve">The Server supports the EquipmentBlocked flag</w:t>
+              <w:t xml:space="preserve">The Server supports the EquipmentInterlock.Blocked flag</w:t>
             </w:r>
           </w:p>
         </w:tc>
@@ -52874,7 +52874,7 @@
             </w:pPr>
             <w:r>
               <w:rPr/>
-              <w:t xml:space="preserve">PackML Equipment Starved</w:t>
+              <w:t xml:space="preserve">PackML EquipmentInterlock Starved</w:t>
             </w:r>
           </w:p>
         </w:tc>
@@ -52889,7 +52889,7 @@
             </w:pPr>
             <w:r>
               <w:rPr/>
-              <w:t xml:space="preserve">The Server supports the EquipmentStarved flag</w:t>
+              <w:t xml:space="preserve">The Server supports the EquipmentInterlock.Starved flag</w:t>
             </w:r>
           </w:p>
         </w:tc>
@@ -54650,7 +54650,7 @@
             </w:pPr>
             <w:r>
               <w:rPr/>
-              <w:t xml:space="preserve">PackML Equipment Blocked Client</w:t>
+              <w:t xml:space="preserve">PackML EquipmentInterlock Blocked Client</w:t>
             </w:r>
           </w:p>
         </w:tc>
@@ -54665,7 +54665,7 @@
             </w:pPr>
             <w:r>
               <w:rPr/>
-              <w:t xml:space="preserve">The Client makes use of the EquipmentBlocked flag</w:t>
+              <w:t xml:space="preserve">The Client makes use of the EquipmentInterlock.Blocked flag</w:t>
             </w:r>
           </w:p>
         </w:tc>
@@ -54698,7 +54698,7 @@
             </w:pPr>
             <w:r>
               <w:rPr/>
-              <w:t xml:space="preserve">PackML Equipment Starved Client</w:t>
+              <w:t xml:space="preserve">PackML EquipmentInterlock Starved Client</w:t>
             </w:r>
           </w:p>
         </w:tc>
@@ -54713,7 +54713,7 @@
             </w:pPr>
             <w:r>
               <w:rPr/>
-              <w:t xml:space="preserve">The Client makes use of the EquipmentStarved flag</w:t>
+              <w:t xml:space="preserve">The Client makes use of the EquipmentInterlock.Starved flag</w:t>
             </w:r>
           </w:p>
         </w:tc>
@@ -54972,7 +54972,7 @@
             <w:pPr>
               <w:pStyle w:val="TABLE-cell"/>
             </w:pPr>
-            <w:hyperlink r:id="R559cc46082d94061">
+            <w:hyperlink r:id="R2d628be677fd428f">
               <w:r>
                 <w:rPr>
                   <w:rStyle w:val="Hyperlink"/>
@@ -55009,7 +55009,7 @@
             <w:pPr>
               <w:pStyle w:val="TABLE-cell"/>
             </w:pPr>
-            <w:hyperlink r:id="R7e3b38ddc6e94057">
+            <w:hyperlink r:id="R491b9dc5359d4249">
               <w:r>
                 <w:rPr>
                   <w:rStyle w:val="Hyperlink"/>
@@ -56786,7 +56786,7 @@
             </w:pPr>
             <w:r>
               <w:rPr/>
-              <w:t xml:space="preserve">PackML Equipment Blocked</w:t>
+              <w:t xml:space="preserve">PackML EquipmentInterlock Blocked</w:t>
             </w:r>
           </w:p>
         </w:tc>
@@ -56834,7 +56834,7 @@
             </w:pPr>
             <w:r>
               <w:rPr/>
-              <w:t xml:space="preserve">PackML Equipment Starved</w:t>
+              <w:t xml:space="preserve">PackML EquipmentInterlock Starved</w:t>
             </w:r>
           </w:p>
         </w:tc>
@@ -58908,7 +58908,7 @@
             </w:pPr>
             <w:r>
               <w:rPr/>
-              <w:t xml:space="preserve">PackML Equipment Blocked Client</w:t>
+              <w:t xml:space="preserve">PackML EquipmentInterlock Blocked Client</w:t>
             </w:r>
           </w:p>
         </w:tc>
@@ -58956,7 +58956,7 @@
             </w:pPr>
             <w:r>
               <w:rPr/>
-              <w:t xml:space="preserve">PackML Equipment Starved Client</w:t>
+              <w:t xml:space="preserve">PackML EquipmentInterlock Starved Client</w:t>
             </w:r>
           </w:p>
         </w:tc>
@@ -59491,7 +59491,7 @@
             </w:pPr>
             <w:r>
               <w:rPr/>
-              <w:t xml:space="preserve">2.0.9</w:t>
+              <w:t xml:space="preserve">2.0.10</w:t>
             </w:r>
           </w:p>
         </w:tc>
@@ -66860,7 +66860,7 @@
       <w:pPr>
         <w:pStyle w:val="PARAGRAPH"/>
       </w:pPr>
-      <w:hyperlink r:id="R061abfd71500454e">
+      <w:hyperlink r:id="R983946e4516e4619">
         <w:r>
           <w:rPr>
             <w:rStyle w:val="Hyperlink"/>
@@ -66887,7 +66887,7 @@
         <w:rPr/>
         <w:t xml:space="preserve"> can be found </w:t>
       </w:r>
-      <w:hyperlink r:id="R2beb3e24551a4964">
+      <w:hyperlink r:id="R3f9c9d12e96a410b">
         <w:r>
           <w:rPr>
             <w:rStyle w:val="Hyperlink"/>
@@ -66913,7 +66913,7 @@
       <w:pPr>
         <w:pStyle w:val="PARAGRAPH"/>
       </w:pPr>
-      <w:hyperlink r:id="R342b42cf488c4ac7">
+      <w:hyperlink r:id="R5b89363659cb4944">
         <w:r>
           <w:rPr>
             <w:rStyle w:val="Hyperlink"/>
@@ -66935,7 +66935,7 @@
       <w:pPr>
         <w:pStyle w:val="PARAGRAPH"/>
       </w:pPr>
-      <w:hyperlink r:id="R7fc821aa9e674006">
+      <w:hyperlink r:id="R05263c5c9f624ea6">
         <w:r>
           <w:rPr>
             <w:rStyle w:val="Hyperlink"/>
@@ -66957,7 +66957,7 @@
       <w:pPr>
         <w:pStyle w:val="PARAGRAPH"/>
       </w:pPr>
-      <w:hyperlink r:id="Rc7b3535a08d641cb">
+      <w:hyperlink r:id="R824981313cb64a7f">
         <w:r>
           <w:rPr>
             <w:rStyle w:val="Hyperlink"/>
@@ -66979,7 +66979,7 @@
       <w:pPr>
         <w:pStyle w:val="PARAGRAPH"/>
       </w:pPr>
-      <w:hyperlink r:id="R158446c130d34fb3">
+      <w:hyperlink r:id="R78501b6b137c4c33">
         <w:r>
           <w:rPr>
             <w:rStyle w:val="Hyperlink"/>

</xml_diff>